<commit_message>
Update README with Study 0 status and manuscript links; fix V1.2->V1.1 label in manuscript
</commit_message>
<xml_diff>
--- a/studies/study_00_simulation/manuscript_apa.docx
+++ b/studies/study_00_simulation/manuscript_apa.docx
@@ -477,7 +477,7 @@
           <w:rFonts w:ascii="Times New Roman" w:hAnsi="Times New Roman"/>
           <w:sz w:val="24"/>
         </w:rPr>
-        <w:t xml:space="preserve">We report two versions of the evidence-evaluation model. The first version (V1) inferred evidence-evaluation ability only indirectly, as a random slope in a model of belief movement. Because this recovered evidence-evaluation poorly and unstably, we redesigned the measurement (V1.2) so that evidence comprehension is a directly observable, binary comprehension-check response, modeled the same way as the verification task. We report both versions here because the contrast is itself a methodological finding: a synthetic benchmark can reveal that a construct is unrecoverable </w:t>
+        <w:t xml:space="preserve">We report two versions of the evidence-evaluation model. The first version (V1) inferred evidence-evaluation ability only indirectly, as a random slope in a model of belief movement. Because this recovered evidence-evaluation poorly and unstably, we redesigned the measurement (V1.1) so that evidence comprehension is a directly observable, binary comprehension-check response, modeled the same way as the verification task. We report both versions here because the contrast is itself a methodological finding: a synthetic benchmark can reveal that a construct is unrecoverable </w:t>
       </w:r>
       <w:r>
         <w:rPr>
@@ -594,7 +594,7 @@
           <w:b/>
           <w:sz w:val="24"/>
         </w:rPr>
-        <w:t>The V1.2 revision.</w:t>
+        <w:t>The V1.1 revision.</w:t>
       </w:r>
       <w:r>
         <w:rPr>
@@ -1405,7 +1405,7 @@
           <w:rFonts w:ascii="Times New Roman" w:hAnsi="Times New Roman"/>
           <w:sz w:val="24"/>
         </w:rPr>
-        <w:t xml:space="preserve"> Evidence-evaluation recovery reflects the V1.2 design, described above. An earlier version, in which evidence-evaluation ability was inferred only as a random slope in the updating model without an observable comprehension response, recovered evidence evaluation at </w:t>
+        <w:t xml:space="preserve"> Evidence-evaluation recovery reflects the V1.1 design, described above. An earlier version, in which evidence-evaluation ability was inferred only as a random slope in the updating model without an observable comprehension response, recovered evidence evaluation at </w:t>
       </w:r>
       <w:r>
         <w:rPr>
@@ -1420,7 +1420,7 @@
           <w:rFonts w:ascii="Times New Roman" w:hAnsi="Times New Roman"/>
           <w:sz w:val="24"/>
         </w:rPr>
-        <w:t xml:space="preserve"> = .133. A first attempt at the V1.2 updating model, which entered the raw (non-centered) `comprehension_correct` response as a shared fixed effect, recovered updating at only </w:t>
+        <w:t xml:space="preserve"> = .133. A first attempt at the V1.1 updating model, which entered the raw (non-centered) `comprehension_correct` response as a shared fixed effect, recovered updating at only </w:t>
       </w:r>
       <w:r>
         <w:rPr>
@@ -1490,7 +1490,7 @@
           <w:rFonts w:ascii="Times New Roman" w:hAnsi="Times New Roman"/>
           <w:sz w:val="24"/>
         </w:rPr>
-        <w:t>Table 2 summarizes recovery across the 13 sweep conditions. Discernment (range = .871–.936), response bias (range = .490–.571), and verification (range = .778–.843) recovery were stable in both sign and approximate magnitude across every condition. Updating recovery was more variable (range = .264–.551) but never fell to zero or reversed sign. Evidence- evaluation recovery under the V1.2 design was stable and strong everywhere tested (range = .684–.748); the same sweep applied to the earlier V1 design had produced negative correlations in 8 of 12 non-baseline conditions (range = −.231 to .228), which we interpret as a measurement-architecture failure rather than evidence that the dimension is inherently unmeasurable.</w:t>
+        <w:t>Table 2 summarizes recovery across the 13 sweep conditions. Discernment (range = .871–.936), response bias (range = .490–.571), and verification (range = .778–.843) recovery were stable in both sign and approximate magnitude across every condition. Updating recovery was more variable (range = .264–.551) but never fell to zero or reversed sign. Evidence- evaluation recovery under the V1.1 design was stable and strong everywhere tested (range = .684–.748); the same sweep applied to the earlier V1 design had produced negative correlations in 8 of 12 non-baseline conditions (range = −.231 to .228), which we interpret as a measurement-architecture failure rather than evidence that the dimension is inherently unmeasurable.</w:t>
       </w:r>
     </w:p>
     <w:p>
@@ -1513,7 +1513,7 @@
           <w:i/>
           <w:sz w:val="24"/>
         </w:rPr>
-        <w:t>Monte Carlo Robustness Sweep (V1.2 Design)</w:t>
+        <w:t>Monte Carlo Robustness Sweep (V1.1 Design)</w:t>
       </w:r>
     </w:p>
     <w:tbl>
@@ -3140,7 +3140,7 @@
           <w:rFonts w:ascii="Times New Roman" w:hAnsi="Times New Roman"/>
           <w:sz w:val="24"/>
         </w:rPr>
-        <w:t>The most informative result in this study is arguably the contrast between the V1 and V1.2 evidence-evaluation models rather than either result in isolation. In V1, evidence comprehension existed only as an internal process variable that the belief-movement calculation used but never exposed as an observable response — essentially, no real assessment could ever have measured it, because it was never something a participant did or said. Its poor, sign-unstable recovery could easily have been (mis)read as evidence that evidence-evaluation ability is not a coherent, separable construct. Once evidence comprehension was operationalized as an explicit, observable comprehension-check response and modeled the same way verification ability already was, recovery became strong and stable. This suggests that at least some of the difficulty other researchers have had in operationalizing evidence-evaluation or evidence-interpretation constructs may be a measurement-design problem rather than a construct-validity problem, though this synthetic result cannot by itself establish which explanation applies to real human data.</w:t>
+        <w:t>The most informative result in this study is arguably the contrast between the V1 and V1.1 evidence-evaluation models rather than either result in isolation. In V1, evidence comprehension existed only as an internal process variable that the belief-movement calculation used but never exposed as an observable response — essentially, no real assessment could ever have measured it, because it was never something a participant did or said. Its poor, sign-unstable recovery could easily have been (mis)read as evidence that evidence-evaluation ability is not a coherent, separable construct. Once evidence comprehension was operationalized as an explicit, observable comprehension-check response and modeled the same way verification ability already was, recovery became strong and stable. This suggests that at least some of the difficulty other researchers have had in operationalizing evidence-evaluation or evidence-interpretation constructs may be a measurement-design problem rather than a construct-validity problem, though this synthetic result cannot by itself establish which explanation applies to real human data.</w:t>
       </w:r>
     </w:p>
     <w:p>

</xml_diff>